<commit_message>
Tighten Game 3 prose: drop causal 'win came from' framing; use last-name-only trio labels
The previous TLDR sentence ('The Game 3 win came from a line reshuffle, not the
same lineup') had two problems flagged in review: (1) 'came from' attributes
the win causally to one factor (a single-game outcome shouldn't be), and (2)
'not the same lineup' is reactive prose, defining the finding by negating a
phrasing rather than just stating it. New version: 'Same 18 skaters in Game 3,
but two reshuffled forward lines.' States the fact, no causal overclaim.

Also: trio labels now render last-name-only ('Texier-Dach-Bolduc' instead of
'Alexandre Texier-Kirby Dach-Zachary Bolduc'). Sportswriting convention.

Co-Authored-By: Claude Opus 4.7 (1M context) <noreply@anthropic.com>
</commit_message>
<xml_diff>
--- a/examples/habs_round1_2026/game3_post_2026-04-25_EN.docx
+++ b/examples/habs_round1_2026/game3_post_2026-04-25_EN.docx
@@ -88,7 +88,7 @@
           <w:sz w:val="20"/>
           <w:szCs w:val="20"/>
         </w:rPr>
-        <w:t xml:space="preserve">The Game 3 win came from a line reshuffle, not the same lineup</w:t>
+        <w:t xml:space="preserve">Same 18 skaters in Game 3, but two reshuffled forward lines.</w:t>
       </w:r>
       <w:r>
         <w:rPr>
@@ -96,7 +96,7 @@
           <w:sz w:val="20"/>
           <w:szCs w:val="20"/>
         </w:rPr>
-        <w:t xml:space="preserve">. MTL kept the same 18 skaters but St-Louis broke up two G2 lines: Alexandre Texier (LW) moved to play with Kirby Dach (C) and Zachary Bolduc (RW), and Oliver Kapanen took the center role between Alex Newhook and Ivan Demidov (the spot Alex Newhook held in Game 2). The new Alexandre Texier-Kirby Dach-Zachary Bolduc line played 6.7 minutes together at 5v5 and produced 2 of MTL's 3 goals. Radio-Canada reported the change pre-game; the shift data confirms it.</w:t>
+        <w:t xml:space="preserve"> Alexandre Texier (LW) moved over to play with Kirby Dach (C) and Bolduc (RW), and Oliver Kapanen took the center role between Newhook and Demidov — the spot Alex Newhook held in Game 2. The new Texier-Dach-Bolduc trio played 6.7 minutes together at 5v5 and scored 2 of MTL's 3 goals. Radio-Canada reported the reshuffle pre-game; the shift data confirms it.</w:t>
       </w:r>
     </w:p>
     <w:p>
@@ -8890,7 +8890,7 @@
         </w:numPr>
         <w:spacing w:after="60"/>
       </w:pPr>
-      <w:hyperlink w:history="1" r:id="rIdzszqmtg2z9dzcl5gg16b7">
+      <w:hyperlink w:history="1" r:id="rIdidi3cr0kukuxkt-tq_zmh">
         <w:r>
           <w:rPr>
             <w:rStyle w:val="Hyperlink"/>
@@ -8911,7 +8911,7 @@
         </w:numPr>
         <w:spacing w:after="60"/>
       </w:pPr>
-      <w:hyperlink w:history="1" r:id="rIddsc2tvorcna-6rdd0ksag">
+      <w:hyperlink w:history="1" r:id="rId3gb4akxmxvp2zcnauy6n0">
         <w:r>
           <w:rPr>
             <w:rStyle w:val="Hyperlink"/>
@@ -8948,7 +8948,7 @@
         </w:numPr>
         <w:spacing w:after="60"/>
       </w:pPr>
-      <w:hyperlink w:history="1" r:id="rIdndagdx9cvm2uesirdwn-h">
+      <w:hyperlink w:history="1" r:id="rIdzf26cg_p0friylycfwwkf">
         <w:r>
           <w:rPr>
             <w:rStyle w:val="Hyperlink"/>
@@ -8969,7 +8969,7 @@
         </w:numPr>
         <w:spacing w:after="60"/>
       </w:pPr>
-      <w:hyperlink w:history="1" r:id="rIdaqin-zr8hz5xd_yxxdyg8">
+      <w:hyperlink w:history="1" r:id="rIdgudme8tyqtghvaxxyvyca">
         <w:r>
           <w:rPr>
             <w:rStyle w:val="Hyperlink"/>
@@ -8990,7 +8990,7 @@
         </w:numPr>
         <w:spacing w:after="60"/>
       </w:pPr>
-      <w:hyperlink w:history="1" r:id="rIdx03bpjholrrqqxpmvty2h">
+      <w:hyperlink w:history="1" r:id="rIdzlkfrwfcsqcolgy0wbv-v">
         <w:r>
           <w:rPr>
             <w:rStyle w:val="Hyperlink"/>
@@ -9011,7 +9011,7 @@
         </w:numPr>
         <w:spacing w:after="60"/>
       </w:pPr>
-      <w:hyperlink w:history="1" r:id="rId41nkteeuqm4pdmvsq9ghs">
+      <w:hyperlink w:history="1" r:id="rId7kjtbswoc480p0tfaufmg">
         <w:r>
           <w:rPr>
             <w:rStyle w:val="Hyperlink"/>
@@ -9032,7 +9032,7 @@
         </w:numPr>
         <w:spacing w:after="60"/>
       </w:pPr>
-      <w:hyperlink w:history="1" r:id="rIdzwy-vgx0konmocz8b3ihc">
+      <w:hyperlink w:history="1" r:id="rIdo5aprjhcsgvvxosjav5m2">
         <w:r>
           <w:rPr>
             <w:rStyle w:val="Hyperlink"/>
@@ -9053,7 +9053,7 @@
         </w:numPr>
         <w:spacing w:after="60"/>
       </w:pPr>
-      <w:hyperlink w:history="1" r:id="rIdokvaitrwovgo7tbzgv0t8">
+      <w:hyperlink w:history="1" r:id="rIdn-_dchvy768cof4vrhpyw">
         <w:r>
           <w:rPr>
             <w:rStyle w:val="Hyperlink"/>
@@ -9090,7 +9090,7 @@
         </w:numPr>
         <w:spacing w:after="60"/>
       </w:pPr>
-      <w:hyperlink w:history="1" r:id="rIdzc6jk9u5e7zs_oko1pao1">
+      <w:hyperlink w:history="1" r:id="rId2m2wozqwidg84o_lpsxj5">
         <w:r>
           <w:rPr>
             <w:rStyle w:val="Hyperlink"/>
@@ -9111,7 +9111,7 @@
         </w:numPr>
         <w:spacing w:after="60"/>
       </w:pPr>
-      <w:hyperlink w:history="1" r:id="rIdg9ga2xdtuxxf3erxxxxml">
+      <w:hyperlink w:history="1" r:id="rId7zrm2hop4mcpqhl_lgki4">
         <w:r>
           <w:rPr>
             <w:rStyle w:val="Hyperlink"/>
@@ -9132,7 +9132,7 @@
         </w:numPr>
         <w:spacing w:after="60"/>
       </w:pPr>
-      <w:hyperlink w:history="1" r:id="rIdqvheo7yyzj04jqkzdbrhz">
+      <w:hyperlink w:history="1" r:id="rIdpl9hyiiowh28tdxoteemi">
         <w:r>
           <w:rPr>
             <w:rStyle w:val="Hyperlink"/>
@@ -9153,7 +9153,7 @@
         </w:numPr>
         <w:spacing w:after="60"/>
       </w:pPr>
-      <w:hyperlink w:history="1" r:id="rIdeycvd3xw3btq2vjan_h-z">
+      <w:hyperlink w:history="1" r:id="rIddh-0poddqtg4lyg81r3y5">
         <w:r>
           <w:rPr>
             <w:rStyle w:val="Hyperlink"/>

</xml_diff>